<commit_message>
Final Settlement Query Update
</commit_message>
<xml_diff>
--- a/APLOS/POPResources/Templates/AssetIssueReport20201.docx
+++ b/APLOS/POPResources/Templates/AssetIssueReport20201.docx
@@ -13,8 +13,327 @@
           <w:szCs w:val="23"/>
         </w:rPr>
       </w:pPr>
-      <w:bookmarkStart w:id="0" w:name="_GoBack"/>
-      <w:bookmarkEnd w:id="0"/>
+      <w:r>
+        <w:rPr>
+          <w:rFonts w:ascii="Arial Narrow" w:eastAsia="Arial" w:hAnsi="Arial Narrow" w:cs="Arial"/>
+          <w:b/>
+          <w:bCs/>
+          <w:noProof/>
+          <w:sz w:val="23"/>
+          <w:szCs w:val="23"/>
+        </w:rPr>
+        <mc:AlternateContent>
+          <mc:Choice Requires="wps">
+            <w:drawing>
+              <wp:anchor distT="45720" distB="45720" distL="114300" distR="114300" simplePos="0" relativeHeight="251683840" behindDoc="1" locked="0" layoutInCell="1" allowOverlap="1" wp14:anchorId="3A56BAC3" wp14:editId="5C20BECD">
+                <wp:simplePos x="0" y="0"/>
+                <wp:positionH relativeFrom="page">
+                  <wp:posOffset>5467350</wp:posOffset>
+                </wp:positionH>
+                <wp:positionV relativeFrom="paragraph">
+                  <wp:posOffset>-628650</wp:posOffset>
+                </wp:positionV>
+                <wp:extent cx="2133600" cy="819150"/>
+                <wp:effectExtent l="0" t="0" r="0" b="0"/>
+                <wp:wrapNone/>
+                <wp:docPr id="11" name="Text Box 2"/>
+                <wp:cNvGraphicFramePr>
+                  <a:graphicFrameLocks xmlns:a="http://schemas.openxmlformats.org/drawingml/2006/main"/>
+                </wp:cNvGraphicFramePr>
+                <a:graphic xmlns:a="http://schemas.openxmlformats.org/drawingml/2006/main">
+                  <a:graphicData uri="http://schemas.microsoft.com/office/word/2010/wordprocessingShape">
+                    <wps:wsp>
+                      <wps:cNvSpPr txBox="1">
+                        <a:spLocks noChangeArrowheads="1"/>
+                      </wps:cNvSpPr>
+                      <wps:spPr bwMode="auto">
+                        <a:xfrm>
+                          <a:off x="0" y="0"/>
+                          <a:ext cx="2133600" cy="819150"/>
+                        </a:xfrm>
+                        <a:prstGeom prst="rect">
+                          <a:avLst/>
+                        </a:prstGeom>
+                        <a:noFill/>
+                        <a:ln w="9525">
+                          <a:noFill/>
+                          <a:miter lim="800000"/>
+                          <a:headEnd/>
+                          <a:tailEnd/>
+                        </a:ln>
+                      </wps:spPr>
+                      <wps:txbx>
+                        <w:txbxContent>
+                          <w:p>
+                            <w:pPr>
+                              <w:spacing w:line="278" w:lineRule="auto"/>
+                              <w:ind w:right="40"/>
+                              <w:jc w:val="center"/>
+                              <w:rPr>
+                                <w:rFonts w:cstheme="minorHAnsi"/>
+                                <w:b/>
+                                <w:bCs/>
+                                <w:sz w:val="24"/>
+                                <w:szCs w:val="24"/>
+                                <w:shd w:val="clear" w:color="auto" w:fill="FFFFFF"/>
+                              </w:rPr>
+                            </w:pPr>
+                            <w:r>
+                              <w:rPr>
+                                <w:rFonts w:cstheme="minorHAnsi"/>
+                                <w:b/>
+                                <w:bCs/>
+                                <w:sz w:val="24"/>
+                                <w:szCs w:val="24"/>
+                                <w:shd w:val="clear" w:color="auto" w:fill="FFFFFF"/>
+                              </w:rPr>
+                              <w:t>Sadma Fashion Wear Ltd</w:t>
+                            </w:r>
+                          </w:p>
+                          <w:p>
+                            <w:pPr>
+                              <w:spacing w:line="278" w:lineRule="auto"/>
+                              <w:ind w:right="40"/>
+                              <w:rPr>
+                                <w:rFonts w:cstheme="minorHAnsi"/>
+                                <w:bCs/>
+                                <w:sz w:val="20"/>
+                                <w:szCs w:val="20"/>
+                                <w:shd w:val="clear" w:color="auto" w:fill="FFFFFF"/>
+                              </w:rPr>
+                            </w:pPr>
+                            <w:r>
+                              <w:rPr>
+                                <w:rFonts w:cstheme="minorHAnsi"/>
+                                <w:bCs/>
+                                <w:sz w:val="24"/>
+                                <w:szCs w:val="24"/>
+                                <w:shd w:val="clear" w:color="auto" w:fill="FFFFFF"/>
+                              </w:rPr>
+                              <w:t xml:space="preserve">  </w:t>
+                            </w:r>
+                            <w:r>
+                              <w:rPr>
+                                <w:rFonts w:cstheme="minorHAnsi"/>
+                                <w:bCs/>
+                                <w:sz w:val="24"/>
+                                <w:szCs w:val="24"/>
+                                <w:shd w:val="clear" w:color="auto" w:fill="FFFFFF"/>
+                              </w:rPr>
+                              <w:t xml:space="preserve">     </w:t>
+                            </w:r>
+                            <w:proofErr w:type="gramStart"/>
+                            <w:r>
+                              <w:rPr>
+                                <w:rFonts w:cstheme="minorHAnsi"/>
+                                <w:bCs/>
+                                <w:sz w:val="20"/>
+                                <w:szCs w:val="20"/>
+                                <w:shd w:val="clear" w:color="auto" w:fill="FFFFFF"/>
+                              </w:rPr>
+                              <w:t>Mouchak (1751), Kaliakair.</w:t>
+                            </w:r>
+                            <w:proofErr w:type="gramEnd"/>
+                          </w:p>
+                          <w:p>
+                            <w:pPr>
+                              <w:spacing w:line="278" w:lineRule="auto"/>
+                              <w:ind w:right="40"/>
+                              <w:jc w:val="center"/>
+                              <w:rPr>
+                                <w:rFonts w:ascii="Arial" w:eastAsia="Arial" w:hAnsi="Arial" w:cs="Arial"/>
+                                <w:sz w:val="20"/>
+                                <w:szCs w:val="20"/>
+                              </w:rPr>
+                            </w:pPr>
+                            <w:proofErr w:type="gramStart"/>
+                            <w:r>
+                              <w:rPr>
+                                <w:rFonts w:cstheme="minorHAnsi"/>
+                                <w:bCs/>
+                                <w:sz w:val="20"/>
+                                <w:szCs w:val="20"/>
+                                <w:shd w:val="clear" w:color="auto" w:fill="FFFFFF"/>
+                              </w:rPr>
+                              <w:t>Gazipur, Dhaka, Bangladesh.</w:t>
+                            </w:r>
+                            <w:proofErr w:type="gramEnd"/>
+                          </w:p>
+                          <w:p>
+                            <w:pPr>
+                              <w:spacing w:line="1" w:lineRule="exact"/>
+                              <w:rPr>
+                                <w:sz w:val="24"/>
+                                <w:szCs w:val="24"/>
+                              </w:rPr>
+                            </w:pPr>
+                          </w:p>
+                          <w:p>
+                            <w:pPr>
+                              <w:spacing w:line="27" w:lineRule="exact"/>
+                              <w:rPr>
+                                <w:sz w:val="24"/>
+                                <w:szCs w:val="24"/>
+                              </w:rPr>
+                            </w:pPr>
+                          </w:p>
+                          <w:p>
+                            <w:pPr>
+                              <w:jc w:val="right"/>
+                            </w:pPr>
+                          </w:p>
+                        </w:txbxContent>
+                      </wps:txbx>
+                      <wps:bodyPr rot="0" vert="horz" wrap="square" lIns="91440" tIns="45720" rIns="91440" bIns="45720" anchor="t" anchorCtr="0">
+                        <a:noAutofit/>
+                      </wps:bodyPr>
+                    </wps:wsp>
+                  </a:graphicData>
+                </a:graphic>
+                <wp14:sizeRelH relativeFrom="margin">
+                  <wp14:pctWidth>0</wp14:pctWidth>
+                </wp14:sizeRelH>
+                <wp14:sizeRelV relativeFrom="margin">
+                  <wp14:pctHeight>0</wp14:pctHeight>
+                </wp14:sizeRelV>
+              </wp:anchor>
+            </w:drawing>
+          </mc:Choice>
+          <mc:Fallback>
+            <w:pict>
+              <v:shapetype id="_x0000_t202" coordsize="21600,21600" o:spt="202" path="m,l,21600r21600,l21600,xe">
+                <v:stroke joinstyle="miter"/>
+                <v:path gradientshapeok="t" o:connecttype="rect"/>
+              </v:shapetype>
+              <v:shape id="Text Box 2" o:spid="_x0000_s1026" type="#_x0000_t202" style="position:absolute;left:0;text-align:left;margin-left:430.5pt;margin-top:-49.5pt;width:168pt;height:64.5pt;z-index:-251632640;visibility:visible;mso-wrap-style:square;mso-width-percent:0;mso-height-percent:0;mso-wrap-distance-left:9pt;mso-wrap-distance-top:3.6pt;mso-wrap-distance-right:9pt;mso-wrap-distance-bottom:3.6pt;mso-position-horizontal:absolute;mso-position-horizontal-relative:page;mso-position-vertical:absolute;mso-position-vertical-relative:text;mso-width-percent:0;mso-height-percent:0;mso-width-relative:margin;mso-height-relative:margin;v-text-anchor:top" o:gfxdata="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" filled="f" stroked="f">
+                <v:textbox>
+                  <w:txbxContent>
+                    <w:p>
+                      <w:pPr>
+                        <w:spacing w:line="278" w:lineRule="auto"/>
+                        <w:ind w:right="40"/>
+                        <w:jc w:val="center"/>
+                        <w:rPr>
+                          <w:rFonts w:cstheme="minorHAnsi"/>
+                          <w:b/>
+                          <w:bCs/>
+                          <w:sz w:val="24"/>
+                          <w:szCs w:val="24"/>
+                          <w:shd w:val="clear" w:color="auto" w:fill="FFFFFF"/>
+                        </w:rPr>
+                      </w:pPr>
+                      <w:r>
+                        <w:rPr>
+                          <w:rFonts w:cstheme="minorHAnsi"/>
+                          <w:b/>
+                          <w:bCs/>
+                          <w:sz w:val="24"/>
+                          <w:szCs w:val="24"/>
+                          <w:shd w:val="clear" w:color="auto" w:fill="FFFFFF"/>
+                        </w:rPr>
+                        <w:t>Sadma Fashion Wear Ltd</w:t>
+                      </w:r>
+                    </w:p>
+                    <w:p>
+                      <w:pPr>
+                        <w:spacing w:line="278" w:lineRule="auto"/>
+                        <w:ind w:right="40"/>
+                        <w:rPr>
+                          <w:rFonts w:cstheme="minorHAnsi"/>
+                          <w:bCs/>
+                          <w:sz w:val="20"/>
+                          <w:szCs w:val="20"/>
+                          <w:shd w:val="clear" w:color="auto" w:fill="FFFFFF"/>
+                        </w:rPr>
+                      </w:pPr>
+                      <w:r>
+                        <w:rPr>
+                          <w:rFonts w:cstheme="minorHAnsi"/>
+                          <w:bCs/>
+                          <w:sz w:val="24"/>
+                          <w:szCs w:val="24"/>
+                          <w:shd w:val="clear" w:color="auto" w:fill="FFFFFF"/>
+                        </w:rPr>
+                        <w:t xml:space="preserve">  </w:t>
+                      </w:r>
+                      <w:r>
+                        <w:rPr>
+                          <w:rFonts w:cstheme="minorHAnsi"/>
+                          <w:bCs/>
+                          <w:sz w:val="24"/>
+                          <w:szCs w:val="24"/>
+                          <w:shd w:val="clear" w:color="auto" w:fill="FFFFFF"/>
+                        </w:rPr>
+                        <w:t xml:space="preserve">     </w:t>
+                      </w:r>
+                      <w:proofErr w:type="gramStart"/>
+                      <w:r>
+                        <w:rPr>
+                          <w:rFonts w:cstheme="minorHAnsi"/>
+                          <w:bCs/>
+                          <w:sz w:val="20"/>
+                          <w:szCs w:val="20"/>
+                          <w:shd w:val="clear" w:color="auto" w:fill="FFFFFF"/>
+                        </w:rPr>
+                        <w:t>Mouchak (1751), Kaliakair.</w:t>
+                      </w:r>
+                      <w:proofErr w:type="gramEnd"/>
+                    </w:p>
+                    <w:p>
+                      <w:pPr>
+                        <w:spacing w:line="278" w:lineRule="auto"/>
+                        <w:ind w:right="40"/>
+                        <w:jc w:val="center"/>
+                        <w:rPr>
+                          <w:rFonts w:ascii="Arial" w:eastAsia="Arial" w:hAnsi="Arial" w:cs="Arial"/>
+                          <w:sz w:val="20"/>
+                          <w:szCs w:val="20"/>
+                        </w:rPr>
+                      </w:pPr>
+                      <w:proofErr w:type="gramStart"/>
+                      <w:r>
+                        <w:rPr>
+                          <w:rFonts w:cstheme="minorHAnsi"/>
+                          <w:bCs/>
+                          <w:sz w:val="20"/>
+                          <w:szCs w:val="20"/>
+                          <w:shd w:val="clear" w:color="auto" w:fill="FFFFFF"/>
+                        </w:rPr>
+                        <w:t>Gazipur, Dhaka, Bangladesh.</w:t>
+                      </w:r>
+                      <w:proofErr w:type="gramEnd"/>
+                    </w:p>
+                    <w:p>
+                      <w:pPr>
+                        <w:spacing w:line="1" w:lineRule="exact"/>
+                        <w:rPr>
+                          <w:sz w:val="24"/>
+                          <w:szCs w:val="24"/>
+                        </w:rPr>
+                      </w:pPr>
+                    </w:p>
+                    <w:p>
+                      <w:pPr>
+                        <w:spacing w:line="27" w:lineRule="exact"/>
+                        <w:rPr>
+                          <w:sz w:val="24"/>
+                          <w:szCs w:val="24"/>
+                        </w:rPr>
+                      </w:pPr>
+                    </w:p>
+                    <w:p>
+                      <w:pPr>
+                        <w:jc w:val="right"/>
+                      </w:pPr>
+                    </w:p>
+                  </w:txbxContent>
+                </v:textbox>
+                <w10:wrap anchorx="page"/>
+              </v:shape>
+            </w:pict>
+          </mc:Fallback>
+        </mc:AlternateContent>
+      </w:r>
     </w:p>
     <w:p>
       <w:pPr>
@@ -25,17 +344,146 @@
           <w:szCs w:val="20"/>
         </w:rPr>
       </w:pPr>
+      <w:r>
+        <w:rPr>
+          <w:rFonts w:ascii="Arial" w:hAnsi="Arial" w:cs="Arial"/>
+          <w:noProof/>
+          <w:sz w:val="20"/>
+          <w:szCs w:val="20"/>
+        </w:rPr>
+        <mc:AlternateContent>
+          <mc:Choice Requires="wps">
+            <w:drawing>
+              <wp:anchor distT="45720" distB="45720" distL="114300" distR="114300" simplePos="0" relativeHeight="251681792" behindDoc="0" locked="0" layoutInCell="1" allowOverlap="1" wp14:anchorId="75C11E2A" wp14:editId="2E2742E0">
+                <wp:simplePos x="0" y="0"/>
+                <wp:positionH relativeFrom="margin">
+                  <wp:posOffset>1600200</wp:posOffset>
+                </wp:positionH>
+                <wp:positionV relativeFrom="paragraph">
+                  <wp:posOffset>31750</wp:posOffset>
+                </wp:positionV>
+                <wp:extent cx="2743200" cy="228600"/>
+                <wp:effectExtent l="0" t="0" r="0" b="0"/>
+                <wp:wrapSquare wrapText="bothSides"/>
+                <wp:docPr id="4" name="Text Box 2"/>
+                <wp:cNvGraphicFramePr>
+                  <a:graphicFrameLocks xmlns:a="http://schemas.openxmlformats.org/drawingml/2006/main"/>
+                </wp:cNvGraphicFramePr>
+                <a:graphic xmlns:a="http://schemas.openxmlformats.org/drawingml/2006/main">
+                  <a:graphicData uri="http://schemas.microsoft.com/office/word/2010/wordprocessingShape">
+                    <wps:wsp>
+                      <wps:cNvSpPr txBox="1">
+                        <a:spLocks noChangeArrowheads="1"/>
+                      </wps:cNvSpPr>
+                      <wps:spPr bwMode="auto">
+                        <a:xfrm>
+                          <a:off x="0" y="0"/>
+                          <a:ext cx="2743200" cy="228600"/>
+                        </a:xfrm>
+                        <a:prstGeom prst="rect">
+                          <a:avLst/>
+                        </a:prstGeom>
+                        <a:noFill/>
+                        <a:ln w="9525">
+                          <a:noFill/>
+                          <a:miter lim="800000"/>
+                          <a:headEnd/>
+                          <a:tailEnd/>
+                        </a:ln>
+                      </wps:spPr>
+                      <wps:txbx>
+                        <w:txbxContent>
+                          <w:p>
+                            <w:pPr>
+                              <w:jc w:val="center"/>
+                            </w:pPr>
+                            <w:r>
+                              <w:rPr>
+                                <w:rFonts w:ascii="Arial,Bold" w:hAnsi="Arial,Bold" w:cs="Arial,Bold"/>
+                                <w:b/>
+                                <w:bCs/>
+                                <w:sz w:val="21"/>
+                                <w:szCs w:val="21"/>
+                              </w:rPr>
+                              <w:t xml:space="preserve">ASSET </w:t>
+                            </w:r>
+                            <w:r>
+                              <w:rPr>
+                                <w:rFonts w:ascii="Arial,Bold" w:hAnsi="Arial,Bold" w:cs="Arial,Bold"/>
+                                <w:b/>
+                                <w:bCs/>
+                                <w:sz w:val="21"/>
+                                <w:szCs w:val="21"/>
+                              </w:rPr>
+                              <w:t>ISSUE</w:t>
+                            </w:r>
+                          </w:p>
+                        </w:txbxContent>
+                      </wps:txbx>
+                      <wps:bodyPr rot="0" vert="horz" wrap="square" lIns="91440" tIns="45720" rIns="91440" bIns="45720" anchor="t" anchorCtr="0">
+                        <a:noAutofit/>
+                      </wps:bodyPr>
+                    </wps:wsp>
+                  </a:graphicData>
+                </a:graphic>
+                <wp14:sizeRelH relativeFrom="margin">
+                  <wp14:pctWidth>0</wp14:pctWidth>
+                </wp14:sizeRelH>
+                <wp14:sizeRelV relativeFrom="margin">
+                  <wp14:pctHeight>0</wp14:pctHeight>
+                </wp14:sizeRelV>
+              </wp:anchor>
+            </w:drawing>
+          </mc:Choice>
+          <mc:Fallback>
+            <w:pict>
+              <v:shape id="_x0000_s1027" type="#_x0000_t202" style="position:absolute;margin-left:126pt;margin-top:2.5pt;width:3in;height:18pt;z-index:251681792;visibility:visible;mso-wrap-style:square;mso-width-percent:0;mso-height-percent:0;mso-wrap-distance-left:9pt;mso-wrap-distance-top:3.6pt;mso-wrap-distance-right:9pt;mso-wrap-distance-bottom:3.6pt;mso-position-horizontal:absolute;mso-position-horizontal-relative:margin;mso-position-vertical:absolute;mso-position-vertical-relative:text;mso-width-percent:0;mso-height-percent:0;mso-width-relative:margin;mso-height-relative:margin;v-text-anchor:top" o:gfxdata="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" filled="f" stroked="f">
+                <v:textbox>
+                  <w:txbxContent>
+                    <w:p>
+                      <w:pPr>
+                        <w:jc w:val="center"/>
+                      </w:pPr>
+                      <w:r>
+                        <w:rPr>
+                          <w:rFonts w:ascii="Arial,Bold" w:hAnsi="Arial,Bold" w:cs="Arial,Bold"/>
+                          <w:b/>
+                          <w:bCs/>
+                          <w:sz w:val="21"/>
+                          <w:szCs w:val="21"/>
+                        </w:rPr>
+                        <w:t xml:space="preserve">ASSET </w:t>
+                      </w:r>
+                      <w:r>
+                        <w:rPr>
+                          <w:rFonts w:ascii="Arial,Bold" w:hAnsi="Arial,Bold" w:cs="Arial,Bold"/>
+                          <w:b/>
+                          <w:bCs/>
+                          <w:sz w:val="21"/>
+                          <w:szCs w:val="21"/>
+                        </w:rPr>
+                        <w:t>ISSUE</w:t>
+                      </w:r>
+                    </w:p>
+                  </w:txbxContent>
+                </v:textbox>
+                <w10:wrap type="square" anchorx="margin"/>
+              </v:shape>
+            </w:pict>
+          </mc:Fallback>
+        </mc:AlternateContent>
+      </w:r>
     </w:p>
     <w:tbl>
       <w:tblPr>
         <w:tblStyle w:val="TableGrid"/>
-        <w:tblpPr w:leftFromText="180" w:rightFromText="180" w:vertAnchor="page" w:horzAnchor="margin" w:tblpX="-594" w:tblpY="2521"/>
-        <w:tblW w:w="18090" w:type="dxa"/>
+        <w:tblpPr w:leftFromText="180" w:rightFromText="180" w:vertAnchor="page" w:horzAnchor="margin" w:tblpXSpec="center" w:tblpY="2236"/>
+        <w:tblW w:w="11340" w:type="dxa"/>
         <w:tblLook w:val="04A0" w:firstRow="1" w:lastRow="0" w:firstColumn="1" w:lastColumn="0" w:noHBand="0" w:noVBand="1"/>
       </w:tblPr>
       <w:tblGrid>
-        <w:gridCol w:w="9036"/>
-        <w:gridCol w:w="9054"/>
+        <w:gridCol w:w="5670"/>
+        <w:gridCol w:w="5670"/>
       </w:tblGrid>
       <w:tr>
         <w:trPr>
@@ -43,7 +491,7 @@
         </w:trPr>
         <w:tc>
           <w:tcPr>
-            <w:tcW w:w="9036" w:type="dxa"/>
+            <w:tcW w:w="5670" w:type="dxa"/>
           </w:tcPr>
           <w:p>
             <w:pPr>
@@ -177,7 +625,7 @@
         </w:tc>
         <w:tc>
           <w:tcPr>
-            <w:tcW w:w="9054" w:type="dxa"/>
+            <w:tcW w:w="5670" w:type="dxa"/>
           </w:tcPr>
           <w:p>
             <w:pPr>
@@ -262,7 +710,7 @@
         </w:trPr>
         <w:tc>
           <w:tcPr>
-            <w:tcW w:w="18090" w:type="dxa"/>
+            <w:tcW w:w="11340" w:type="dxa"/>
             <w:gridSpan w:val="2"/>
             <w:tcBorders>
               <w:left w:val="single" w:sz="4" w:space="0" w:color="auto"/>
@@ -467,7 +915,7 @@
         </w:trPr>
         <w:tc>
           <w:tcPr>
-            <w:tcW w:w="18090" w:type="dxa"/>
+            <w:tcW w:w="11340" w:type="dxa"/>
             <w:gridSpan w:val="2"/>
             <w:tcBorders>
               <w:left w:val="single" w:sz="4" w:space="0" w:color="auto"/>
@@ -489,7 +937,6 @@
             <w:tblPr>
               <w:tblStyle w:val="TableGrid"/>
               <w:tblW w:w="0" w:type="auto"/>
-              <w:jc w:val="center"/>
               <w:tblBorders>
                 <w:top w:val="none" w:sz="0" w:space="0" w:color="auto"/>
                 <w:left w:val="none" w:sz="0" w:space="0" w:color="auto"/>
@@ -507,7 +954,6 @@
             <w:tr>
               <w:trPr>
                 <w:trHeight w:val="1365"/>
-                <w:jc w:val="center"/>
               </w:trPr>
               <w:tc>
                 <w:tcPr>
@@ -515,7 +961,7 @@
                 </w:tcPr>
                 <w:p>
                   <w:pPr>
-                    <w:framePr w:hSpace="180" w:wrap="around" w:vAnchor="page" w:hAnchor="margin" w:x="-594" w:y="2521"/>
+                    <w:framePr w:hSpace="180" w:wrap="around" w:vAnchor="page" w:hAnchor="margin" w:xAlign="center" w:y="2236"/>
                     <w:jc w:val="center"/>
                     <w:rPr>
                       <w:rFonts w:ascii="Arial Narrow" w:eastAsia="Arial" w:hAnsi="Arial Narrow" w:cs="Arial"/>
@@ -536,7 +982,7 @@
                 </w:p>
                 <w:p>
                   <w:pPr>
-                    <w:framePr w:hSpace="180" w:wrap="around" w:vAnchor="page" w:hAnchor="margin" w:x="-594" w:y="2521"/>
+                    <w:framePr w:hSpace="180" w:wrap="around" w:vAnchor="page" w:hAnchor="margin" w:xAlign="center" w:y="2236"/>
                     <w:jc w:val="center"/>
                     <w:rPr>
                       <w:rFonts w:ascii="Arial Narrow" w:eastAsia="Arial" w:hAnsi="Arial Narrow" w:cs="Arial"/>
@@ -557,7 +1003,7 @@
                 </w:p>
                 <w:p>
                   <w:pPr>
-                    <w:framePr w:hSpace="180" w:wrap="around" w:vAnchor="page" w:hAnchor="margin" w:x="-594" w:y="2521"/>
+                    <w:framePr w:hSpace="180" w:wrap="around" w:vAnchor="page" w:hAnchor="margin" w:xAlign="center" w:y="2236"/>
                     <w:spacing w:line="278" w:lineRule="auto"/>
                     <w:ind w:right="40"/>
                     <w:jc w:val="center"/>
@@ -605,7 +1051,7 @@
                 </w:p>
                 <w:p>
                   <w:pPr>
-                    <w:framePr w:hSpace="180" w:wrap="around" w:vAnchor="page" w:hAnchor="margin" w:x="-594" w:y="2521"/>
+                    <w:framePr w:hSpace="180" w:wrap="around" w:vAnchor="page" w:hAnchor="margin" w:xAlign="center" w:y="2236"/>
                     <w:jc w:val="center"/>
                     <w:rPr>
                       <w:rFonts w:ascii="Arial Narrow" w:eastAsia="Arial" w:hAnsi="Arial Narrow" w:cs="Arial"/>
@@ -618,7 +1064,7 @@
                 </w:p>
                 <w:p>
                   <w:pPr>
-                    <w:framePr w:hSpace="180" w:wrap="around" w:vAnchor="page" w:hAnchor="margin" w:x="-594" w:y="2521"/>
+                    <w:framePr w:hSpace="180" w:wrap="around" w:vAnchor="page" w:hAnchor="margin" w:xAlign="center" w:y="2236"/>
                     <w:rPr>
                       <w:rFonts w:ascii="Arial Narrow" w:eastAsia="Arial" w:hAnsi="Arial Narrow" w:cs="Arial"/>
                       <w:b/>
@@ -630,7 +1076,7 @@
                 </w:p>
                 <w:p>
                   <w:pPr>
-                    <w:framePr w:hSpace="180" w:wrap="around" w:vAnchor="page" w:hAnchor="margin" w:x="-594" w:y="2521"/>
+                    <w:framePr w:hSpace="180" w:wrap="around" w:vAnchor="page" w:hAnchor="margin" w:xAlign="center" w:y="2236"/>
                     <w:rPr>
                       <w:rFonts w:ascii="Arial Narrow" w:eastAsia="Arial" w:hAnsi="Arial Narrow" w:cs="Arial"/>
                       <w:bCs/>
@@ -641,7 +1087,7 @@
                 </w:p>
                 <w:p>
                   <w:pPr>
-                    <w:framePr w:hSpace="180" w:wrap="around" w:vAnchor="page" w:hAnchor="margin" w:x="-594" w:y="2521"/>
+                    <w:framePr w:hSpace="180" w:wrap="around" w:vAnchor="page" w:hAnchor="margin" w:xAlign="center" w:y="2236"/>
                     <w:jc w:val="center"/>
                     <w:rPr>
                       <w:rFonts w:ascii="Arial Narrow" w:eastAsia="Arial" w:hAnsi="Arial Narrow" w:cs="Arial"/>
@@ -669,7 +1115,7 @@
                 </w:tcPr>
                 <w:p>
                   <w:pPr>
-                    <w:framePr w:hSpace="180" w:wrap="around" w:vAnchor="page" w:hAnchor="margin" w:x="-594" w:y="2521"/>
+                    <w:framePr w:hSpace="180" w:wrap="around" w:vAnchor="page" w:hAnchor="margin" w:xAlign="center" w:y="2236"/>
                     <w:jc w:val="center"/>
                     <w:rPr>
                       <w:rFonts w:ascii="Arial Narrow" w:eastAsia="Arial" w:hAnsi="Arial Narrow" w:cs="Arial"/>
@@ -683,7 +1129,7 @@
                 </w:p>
                 <w:p>
                   <w:pPr>
-                    <w:framePr w:hSpace="180" w:wrap="around" w:vAnchor="page" w:hAnchor="margin" w:x="-594" w:y="2521"/>
+                    <w:framePr w:hSpace="180" w:wrap="around" w:vAnchor="page" w:hAnchor="margin" w:xAlign="center" w:y="2236"/>
                     <w:jc w:val="center"/>
                     <w:rPr>
                       <w:rFonts w:ascii="Arial Narrow" w:eastAsia="Arial" w:hAnsi="Arial Narrow" w:cs="Arial"/>
@@ -728,7 +1174,7 @@
                 </w:p>
                 <w:p>
                   <w:pPr>
-                    <w:framePr w:hSpace="180" w:wrap="around" w:vAnchor="page" w:hAnchor="margin" w:x="-594" w:y="2521"/>
+                    <w:framePr w:hSpace="180" w:wrap="around" w:vAnchor="page" w:hAnchor="margin" w:xAlign="center" w:y="2236"/>
                     <w:rPr>
                       <w:rFonts w:ascii="Arial Narrow" w:eastAsia="Arial" w:hAnsi="Arial Narrow" w:cs="Arial"/>
                       <w:b/>
@@ -741,7 +1187,7 @@
                 </w:p>
                 <w:p>
                   <w:pPr>
-                    <w:framePr w:hSpace="180" w:wrap="around" w:vAnchor="page" w:hAnchor="margin" w:x="-594" w:y="2521"/>
+                    <w:framePr w:hSpace="180" w:wrap="around" w:vAnchor="page" w:hAnchor="margin" w:xAlign="center" w:y="2236"/>
                     <w:jc w:val="center"/>
                     <w:rPr>
                       <w:rFonts w:ascii="Arial Narrow" w:eastAsia="Arial" w:hAnsi="Arial Narrow" w:cs="Arial"/>
@@ -755,7 +1201,7 @@
                 </w:p>
                 <w:p>
                   <w:pPr>
-                    <w:framePr w:hSpace="180" w:wrap="around" w:vAnchor="page" w:hAnchor="margin" w:x="-594" w:y="2521"/>
+                    <w:framePr w:hSpace="180" w:wrap="around" w:vAnchor="page" w:hAnchor="margin" w:xAlign="center" w:y="2236"/>
                     <w:jc w:val="center"/>
                     <w:rPr>
                       <w:rFonts w:ascii="Arial Narrow" w:eastAsia="Arial" w:hAnsi="Arial Narrow" w:cs="Arial"/>
@@ -769,7 +1215,7 @@
                 </w:p>
                 <w:p>
                   <w:pPr>
-                    <w:framePr w:hSpace="180" w:wrap="around" w:vAnchor="page" w:hAnchor="margin" w:x="-594" w:y="2521"/>
+                    <w:framePr w:hSpace="180" w:wrap="around" w:vAnchor="page" w:hAnchor="margin" w:xAlign="center" w:y="2236"/>
                     <w:jc w:val="center"/>
                     <w:rPr>
                       <w:rFonts w:ascii="Arial Narrow" w:eastAsia="Arial" w:hAnsi="Arial Narrow" w:cs="Arial"/>
@@ -814,159 +1260,16 @@
           <w:szCs w:val="20"/>
         </w:rPr>
       </w:pPr>
-      <w:r>
-        <w:rPr>
-          <w:rFonts w:ascii="Arial" w:hAnsi="Arial" w:cs="Arial"/>
-          <w:noProof/>
-          <w:sz w:val="20"/>
-          <w:szCs w:val="20"/>
-        </w:rPr>
-        <mc:AlternateContent>
-          <mc:Choice Requires="wps">
-            <w:drawing>
-              <wp:anchor distT="45720" distB="45720" distL="114300" distR="114300" simplePos="0" relativeHeight="251681792" behindDoc="0" locked="0" layoutInCell="1" allowOverlap="1" wp14:anchorId="75C11E2A" wp14:editId="6AE3C925">
-                <wp:simplePos x="0" y="0"/>
-                <wp:positionH relativeFrom="margin">
-                  <wp:posOffset>-548005</wp:posOffset>
-                </wp:positionH>
-                <wp:positionV relativeFrom="paragraph">
-                  <wp:posOffset>109220</wp:posOffset>
-                </wp:positionV>
-                <wp:extent cx="2743200" cy="257175"/>
-                <wp:effectExtent l="0" t="0" r="0" b="0"/>
-                <wp:wrapSquare wrapText="bothSides"/>
-                <wp:docPr id="4" name="Text Box 2"/>
-                <wp:cNvGraphicFramePr>
-                  <a:graphicFrameLocks xmlns:a="http://schemas.openxmlformats.org/drawingml/2006/main"/>
-                </wp:cNvGraphicFramePr>
-                <a:graphic xmlns:a="http://schemas.openxmlformats.org/drawingml/2006/main">
-                  <a:graphicData uri="http://schemas.microsoft.com/office/word/2010/wordprocessingShape">
-                    <wps:wsp>
-                      <wps:cNvSpPr txBox="1">
-                        <a:spLocks noChangeArrowheads="1"/>
-                      </wps:cNvSpPr>
-                      <wps:spPr bwMode="auto">
-                        <a:xfrm>
-                          <a:off x="0" y="0"/>
-                          <a:ext cx="2743200" cy="257175"/>
-                        </a:xfrm>
-                        <a:prstGeom prst="rect">
-                          <a:avLst/>
-                        </a:prstGeom>
-                        <a:noFill/>
-                        <a:ln w="9525">
-                          <a:noFill/>
-                          <a:miter lim="800000"/>
-                          <a:headEnd/>
-                          <a:tailEnd/>
-                        </a:ln>
-                      </wps:spPr>
-                      <wps:txbx>
-                        <w:txbxContent>
-                          <w:p>
-                            <w:pPr>
-                              <w:rPr>
-                                <w:rFonts w:ascii="Tahoma" w:hAnsi="Tahoma" w:cs="Tahoma"/>
-                                <w:sz w:val="20"/>
-                                <w:szCs w:val="20"/>
-                                <w:u w:val="single"/>
-                              </w:rPr>
-                            </w:pPr>
-                            <w:r>
-                              <w:rPr>
-                                <w:rFonts w:ascii="Tahoma" w:hAnsi="Tahoma" w:cs="Tahoma"/>
-                                <w:b/>
-                                <w:bCs/>
-                                <w:sz w:val="20"/>
-                                <w:szCs w:val="20"/>
-                                <w:u w:val="single"/>
-                              </w:rPr>
-                              <w:t xml:space="preserve">ASSET </w:t>
-                            </w:r>
-                            <w:r>
-                              <w:rPr>
-                                <w:rFonts w:ascii="Tahoma" w:hAnsi="Tahoma" w:cs="Tahoma"/>
-                                <w:b/>
-                                <w:bCs/>
-                                <w:sz w:val="20"/>
-                                <w:szCs w:val="20"/>
-                                <w:u w:val="single"/>
-                              </w:rPr>
-                              <w:t>ISSUE</w:t>
-                            </w:r>
-                          </w:p>
-                        </w:txbxContent>
-                      </wps:txbx>
-                      <wps:bodyPr rot="0" vert="horz" wrap="square" lIns="91440" tIns="45720" rIns="91440" bIns="45720" anchor="t" anchorCtr="0">
-                        <a:noAutofit/>
-                      </wps:bodyPr>
-                    </wps:wsp>
-                  </a:graphicData>
-                </a:graphic>
-                <wp14:sizeRelH relativeFrom="margin">
-                  <wp14:pctWidth>0</wp14:pctWidth>
-                </wp14:sizeRelH>
-                <wp14:sizeRelV relativeFrom="margin">
-                  <wp14:pctHeight>0</wp14:pctHeight>
-                </wp14:sizeRelV>
-              </wp:anchor>
-            </w:drawing>
-          </mc:Choice>
-          <mc:Fallback>
-            <w:pict>
-              <v:shapetype id="_x0000_t202" coordsize="21600,21600" o:spt="202" path="m,l,21600r21600,l21600,xe">
-                <v:stroke joinstyle="miter"/>
-                <v:path gradientshapeok="t" o:connecttype="rect"/>
-              </v:shapetype>
-              <v:shape id="Text Box 2" o:spid="_x0000_s1026" type="#_x0000_t202" style="position:absolute;margin-left:-43.15pt;margin-top:8.6pt;width:3in;height:20.25pt;z-index:251681792;visibility:visible;mso-wrap-style:square;mso-width-percent:0;mso-height-percent:0;mso-wrap-distance-left:9pt;mso-wrap-distance-top:3.6pt;mso-wrap-distance-right:9pt;mso-wrap-distance-bottom:3.6pt;mso-position-horizontal:absolute;mso-position-horizontal-relative:margin;mso-position-vertical:absolute;mso-position-vertical-relative:text;mso-width-percent:0;mso-height-percent:0;mso-width-relative:margin;mso-height-relative:margin;v-text-anchor:top" o:gfxdata="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" filled="f" stroked="f">
-                <v:textbox>
-                  <w:txbxContent>
-                    <w:p>
-                      <w:pPr>
-                        <w:rPr>
-                          <w:rFonts w:ascii="Tahoma" w:hAnsi="Tahoma" w:cs="Tahoma"/>
-                          <w:sz w:val="20"/>
-                          <w:szCs w:val="20"/>
-                          <w:u w:val="single"/>
-                        </w:rPr>
-                      </w:pPr>
-                      <w:r>
-                        <w:rPr>
-                          <w:rFonts w:ascii="Tahoma" w:hAnsi="Tahoma" w:cs="Tahoma"/>
-                          <w:b/>
-                          <w:bCs/>
-                          <w:sz w:val="20"/>
-                          <w:szCs w:val="20"/>
-                          <w:u w:val="single"/>
-                        </w:rPr>
-                        <w:t xml:space="preserve">ASSET </w:t>
-                      </w:r>
-                      <w:r>
-                        <w:rPr>
-                          <w:rFonts w:ascii="Tahoma" w:hAnsi="Tahoma" w:cs="Tahoma"/>
-                          <w:b/>
-                          <w:bCs/>
-                          <w:sz w:val="20"/>
-                          <w:szCs w:val="20"/>
-                          <w:u w:val="single"/>
-                        </w:rPr>
-                        <w:t>ISSUE</w:t>
-                      </w:r>
-                    </w:p>
-                  </w:txbxContent>
-                </v:textbox>
-                <w10:wrap type="square" anchorx="margin"/>
-              </v:shape>
-            </w:pict>
-          </mc:Fallback>
-        </mc:AlternateContent>
-      </w:r>
     </w:p>
     <w:sectPr>
-      <w:headerReference w:type="default" r:id="rId9"/>
-      <w:footerReference w:type="default" r:id="rId10"/>
-      <w:pgSz w:w="20160" w:h="12240" w:orient="landscape" w:code="5"/>
-      <w:pgMar w:top="1440" w:right="1800" w:bottom="1440" w:left="1800" w:header="0" w:footer="0" w:gutter="0"/>
+      <w:headerReference w:type="even" r:id="rId9"/>
+      <w:headerReference w:type="default" r:id="rId10"/>
+      <w:footerReference w:type="even" r:id="rId11"/>
+      <w:footerReference w:type="default" r:id="rId12"/>
+      <w:headerReference w:type="first" r:id="rId13"/>
+      <w:footerReference w:type="first" r:id="rId14"/>
+      <w:pgSz w:w="12240" w:h="15840"/>
+      <w:pgMar w:top="1260" w:right="1440" w:bottom="360" w:left="1440" w:header="0" w:footer="285" w:gutter="0"/>
       <w:cols w:space="720"/>
       <w:docGrid w:linePitch="360"/>
     </w:sectPr>
@@ -978,6 +1281,9 @@
 <w:endnotes xmlns:wpc="http://schemas.microsoft.com/office/word/2010/wordprocessingCanvas" xmlns:mc="http://schemas.openxmlformats.org/markup-compatibility/2006" xmlns:o="urn:schemas-microsoft-com:office:office" xmlns:r="http://schemas.openxmlformats.org/officeDocument/2006/relationships" xmlns:m="http://schemas.openxmlformats.org/officeDocument/2006/math" xmlns:v="urn:schemas-microsoft-com:vml" xmlns:wp14="http://schemas.microsoft.com/office/word/2010/wordprocessingDrawing" xmlns:wp="http://schemas.openxmlformats.org/drawingml/2006/wordprocessingDrawing" xmlns:w10="urn:schemas-microsoft-com:office:word" xmlns:w="http://schemas.openxmlformats.org/wordprocessingml/2006/main" xmlns:w14="http://schemas.microsoft.com/office/word/2010/wordml" xmlns:wpg="http://schemas.microsoft.com/office/word/2010/wordprocessingGroup" xmlns:wpi="http://schemas.microsoft.com/office/word/2010/wordprocessingInk" xmlns:wne="http://schemas.microsoft.com/office/word/2006/wordml" xmlns:wps="http://schemas.microsoft.com/office/word/2010/wordprocessingShape" mc:Ignorable="w14 wp14">
   <w:endnote w:type="separator" w:id="-1">
     <w:p>
+      <w:pPr>
+        <w:spacing w:after="0" w:line="240" w:lineRule="auto"/>
+      </w:pPr>
       <w:r>
         <w:separator/>
       </w:r>
@@ -985,6 +1291,9 @@
   </w:endnote>
   <w:endnote w:type="continuationSeparator" w:id="0">
     <w:p>
+      <w:pPr>
+        <w:spacing w:after="0" w:line="240" w:lineRule="auto"/>
+      </w:pPr>
       <w:r>
         <w:continuationSeparator/>
       </w:r>
@@ -995,131 +1304,101 @@
 
 <file path=word/footer1.xml><?xml version="1.0" encoding="utf-8"?>
 <w:ftr xmlns:wpc="http://schemas.microsoft.com/office/word/2010/wordprocessingCanvas" xmlns:mc="http://schemas.openxmlformats.org/markup-compatibility/2006" xmlns:o="urn:schemas-microsoft-com:office:office" xmlns:r="http://schemas.openxmlformats.org/officeDocument/2006/relationships" xmlns:m="http://schemas.openxmlformats.org/officeDocument/2006/math" xmlns:v="urn:schemas-microsoft-com:vml" xmlns:wp14="http://schemas.microsoft.com/office/word/2010/wordprocessingDrawing" xmlns:wp="http://schemas.openxmlformats.org/drawingml/2006/wordprocessingDrawing" xmlns:w10="urn:schemas-microsoft-com:office:word" xmlns:w="http://schemas.openxmlformats.org/wordprocessingml/2006/main" xmlns:w14="http://schemas.microsoft.com/office/word/2010/wordml" xmlns:wpg="http://schemas.microsoft.com/office/word/2010/wordprocessingGroup" xmlns:wpi="http://schemas.microsoft.com/office/word/2010/wordprocessingInk" xmlns:wne="http://schemas.microsoft.com/office/word/2006/wordml" xmlns:wps="http://schemas.microsoft.com/office/word/2010/wordprocessingShape" mc:Ignorable="w14 wp14">
-  <w:sdt>
-    <w:sdtPr>
-      <w:id w:val="220327701"/>
-      <w:docPartObj>
-        <w:docPartGallery w:val="Page Numbers (Bottom of Page)"/>
-        <w:docPartUnique/>
-      </w:docPartObj>
-    </w:sdtPr>
-    <w:sdtEndPr>
-      <w:rPr>
-        <w:noProof/>
-      </w:rPr>
-    </w:sdtEndPr>
-    <w:sdtContent>
-      <w:p>
-        <w:pPr>
-          <w:pStyle w:val="Footer"/>
-          <w:jc w:val="right"/>
-        </w:pPr>
-        <w:r>
-          <w:fldChar w:fldCharType="begin"/>
-        </w:r>
-        <w:r>
-          <w:instrText xml:space="preserve"> PAGE   \* MERGEFORMAT </w:instrText>
-        </w:r>
-        <w:r>
-          <w:fldChar w:fldCharType="separate"/>
-        </w:r>
-        <w:r>
-          <w:rPr>
-            <w:noProof/>
-          </w:rPr>
-          <w:t>1</w:t>
-        </w:r>
-        <w:r>
-          <w:rPr>
-            <w:noProof/>
-          </w:rPr>
-          <w:fldChar w:fldCharType="end"/>
-        </w:r>
-      </w:p>
-    </w:sdtContent>
-  </w:sdt>
+  <w:p>
+    <w:pPr>
+      <w:pStyle w:val="Footer"/>
+    </w:pPr>
+  </w:p>
+</w:ftr>
+</file>
+
+<file path=word/footer2.xml><?xml version="1.0" encoding="utf-8"?>
+<w:ftr xmlns:wpc="http://schemas.microsoft.com/office/word/2010/wordprocessingCanvas" xmlns:mc="http://schemas.openxmlformats.org/markup-compatibility/2006" xmlns:o="urn:schemas-microsoft-com:office:office" xmlns:r="http://schemas.openxmlformats.org/officeDocument/2006/relationships" xmlns:m="http://schemas.openxmlformats.org/officeDocument/2006/math" xmlns:v="urn:schemas-microsoft-com:vml" xmlns:wp14="http://schemas.microsoft.com/office/word/2010/wordprocessingDrawing" xmlns:wp="http://schemas.openxmlformats.org/drawingml/2006/wordprocessingDrawing" xmlns:w10="urn:schemas-microsoft-com:office:word" xmlns:w="http://schemas.openxmlformats.org/wordprocessingml/2006/main" xmlns:w14="http://schemas.microsoft.com/office/word/2010/wordml" xmlns:wpg="http://schemas.microsoft.com/office/word/2010/wordprocessingGroup" xmlns:wpi="http://schemas.microsoft.com/office/word/2010/wordprocessingInk" xmlns:wne="http://schemas.microsoft.com/office/word/2006/wordml" xmlns:wps="http://schemas.microsoft.com/office/word/2010/wordprocessingShape" mc:Ignorable="w14 wp14">
   <w:p>
     <w:pPr>
       <w:pStyle w:val="Footer"/>
       <w:jc w:val="center"/>
       <w:rPr>
-        <w:rFonts w:ascii="Tahoma" w:hAnsi="Tahoma" w:cs="Tahoma"/>
-        <w:sz w:val="16"/>
-        <w:szCs w:val="16"/>
+        <w:sz w:val="20"/>
+        <w:szCs w:val="20"/>
       </w:rPr>
     </w:pPr>
+    <w:bookmarkStart w:id="0" w:name="_GoBack"/>
     <w:proofErr w:type="spellStart"/>
     <w:r>
       <w:rPr>
-        <w:rFonts w:ascii="Tahoma" w:hAnsi="Tahoma" w:cs="Tahoma"/>
-        <w:sz w:val="16"/>
-        <w:szCs w:val="16"/>
+        <w:sz w:val="20"/>
+        <w:szCs w:val="20"/>
       </w:rPr>
       <w:t>Sadma</w:t>
     </w:r>
     <w:proofErr w:type="spellEnd"/>
     <w:r>
       <w:rPr>
-        <w:rFonts w:ascii="Tahoma" w:hAnsi="Tahoma" w:cs="Tahoma"/>
-        <w:sz w:val="16"/>
-        <w:szCs w:val="16"/>
+        <w:sz w:val="20"/>
+        <w:szCs w:val="20"/>
       </w:rPr>
       <w:t xml:space="preserve"> Fashion Wear Ltd </w:t>
     </w:r>
     <w:proofErr w:type="spellStart"/>
     <w:r>
       <w:rPr>
-        <w:rFonts w:ascii="Tahoma" w:hAnsi="Tahoma" w:cs="Tahoma"/>
-        <w:sz w:val="16"/>
-        <w:szCs w:val="16"/>
+        <w:sz w:val="20"/>
+        <w:szCs w:val="20"/>
       </w:rPr>
       <w:t>Mouchak</w:t>
     </w:r>
     <w:proofErr w:type="spellEnd"/>
     <w:r>
       <w:rPr>
-        <w:rFonts w:ascii="Tahoma" w:hAnsi="Tahoma" w:cs="Tahoma"/>
-        <w:sz w:val="16"/>
-        <w:szCs w:val="16"/>
+        <w:sz w:val="20"/>
+        <w:szCs w:val="20"/>
       </w:rPr>
       <w:t xml:space="preserve"> (1751), </w:t>
     </w:r>
     <w:proofErr w:type="spellStart"/>
     <w:r>
       <w:rPr>
-        <w:rFonts w:ascii="Tahoma" w:hAnsi="Tahoma" w:cs="Tahoma"/>
-        <w:sz w:val="16"/>
-        <w:szCs w:val="16"/>
+        <w:sz w:val="20"/>
+        <w:szCs w:val="20"/>
       </w:rPr>
       <w:t>Kaliakair</w:t>
     </w:r>
     <w:proofErr w:type="spellEnd"/>
     <w:r>
       <w:rPr>
-        <w:rFonts w:ascii="Tahoma" w:hAnsi="Tahoma" w:cs="Tahoma"/>
-        <w:sz w:val="16"/>
-        <w:szCs w:val="16"/>
+        <w:sz w:val="20"/>
+        <w:szCs w:val="20"/>
       </w:rPr>
-      <w:t xml:space="preserve">.  </w:t>
+      <w:t xml:space="preserve">. </w:t>
     </w:r>
     <w:proofErr w:type="spellStart"/>
     <w:r>
       <w:rPr>
-        <w:rFonts w:ascii="Tahoma" w:hAnsi="Tahoma" w:cs="Tahoma"/>
-        <w:sz w:val="16"/>
-        <w:szCs w:val="16"/>
+        <w:sz w:val="20"/>
+        <w:szCs w:val="20"/>
       </w:rPr>
       <w:t>Gazipur</w:t>
     </w:r>
     <w:proofErr w:type="spellEnd"/>
     <w:r>
       <w:rPr>
-        <w:rFonts w:ascii="Tahoma" w:hAnsi="Tahoma" w:cs="Tahoma"/>
-        <w:sz w:val="16"/>
-        <w:szCs w:val="16"/>
+        <w:sz w:val="20"/>
+        <w:szCs w:val="20"/>
       </w:rPr>
       <w:t>, Dhaka, Bangladesh.</w:t>
     </w:r>
+    <w:bookmarkEnd w:id="0"/>
+  </w:p>
+</w:ftr>
+</file>
+
+<file path=word/footer3.xml><?xml version="1.0" encoding="utf-8"?>
+<w:ftr xmlns:wpc="http://schemas.microsoft.com/office/word/2010/wordprocessingCanvas" xmlns:mc="http://schemas.openxmlformats.org/markup-compatibility/2006" xmlns:o="urn:schemas-microsoft-com:office:office" xmlns:r="http://schemas.openxmlformats.org/officeDocument/2006/relationships" xmlns:m="http://schemas.openxmlformats.org/officeDocument/2006/math" xmlns:v="urn:schemas-microsoft-com:vml" xmlns:wp14="http://schemas.microsoft.com/office/word/2010/wordprocessingDrawing" xmlns:wp="http://schemas.openxmlformats.org/drawingml/2006/wordprocessingDrawing" xmlns:w10="urn:schemas-microsoft-com:office:word" xmlns:w="http://schemas.openxmlformats.org/wordprocessingml/2006/main" xmlns:w14="http://schemas.microsoft.com/office/word/2010/wordml" xmlns:wpg="http://schemas.microsoft.com/office/word/2010/wordprocessingGroup" xmlns:wpi="http://schemas.microsoft.com/office/word/2010/wordprocessingInk" xmlns:wne="http://schemas.microsoft.com/office/word/2006/wordml" xmlns:wps="http://schemas.microsoft.com/office/word/2010/wordprocessingShape" mc:Ignorable="w14 wp14">
+  <w:p>
+    <w:pPr>
+      <w:pStyle w:val="Footer"/>
+    </w:pPr>
   </w:p>
 </w:ftr>
 </file>
@@ -1128,6 +1407,9 @@
 <w:footnotes xmlns:wpc="http://schemas.microsoft.com/office/word/2010/wordprocessingCanvas" xmlns:mc="http://schemas.openxmlformats.org/markup-compatibility/2006" xmlns:o="urn:schemas-microsoft-com:office:office" xmlns:r="http://schemas.openxmlformats.org/officeDocument/2006/relationships" xmlns:m="http://schemas.openxmlformats.org/officeDocument/2006/math" xmlns:v="urn:schemas-microsoft-com:vml" xmlns:wp14="http://schemas.microsoft.com/office/word/2010/wordprocessingDrawing" xmlns:wp="http://schemas.openxmlformats.org/drawingml/2006/wordprocessingDrawing" xmlns:w10="urn:schemas-microsoft-com:office:word" xmlns:w="http://schemas.openxmlformats.org/wordprocessingml/2006/main" xmlns:w14="http://schemas.microsoft.com/office/word/2010/wordml" xmlns:wpg="http://schemas.microsoft.com/office/word/2010/wordprocessingGroup" xmlns:wpi="http://schemas.microsoft.com/office/word/2010/wordprocessingInk" xmlns:wne="http://schemas.microsoft.com/office/word/2006/wordml" xmlns:wps="http://schemas.microsoft.com/office/word/2010/wordprocessingShape" mc:Ignorable="w14 wp14">
   <w:footnote w:type="separator" w:id="-1">
     <w:p>
+      <w:pPr>
+        <w:spacing w:after="0" w:line="240" w:lineRule="auto"/>
+      </w:pPr>
       <w:r>
         <w:separator/>
       </w:r>
@@ -1135,6 +1417,9 @@
   </w:footnote>
   <w:footnote w:type="continuationSeparator" w:id="0">
     <w:p>
+      <w:pPr>
+        <w:spacing w:after="0" w:line="240" w:lineRule="auto"/>
+      </w:pPr>
       <w:r>
         <w:continuationSeparator/>
       </w:r>
@@ -1150,482 +1435,26 @@
       <w:pStyle w:val="Header"/>
     </w:pPr>
   </w:p>
+</w:hdr>
+</file>
+
+<file path=word/header2.xml><?xml version="1.0" encoding="utf-8"?>
+<w:hdr xmlns:wpc="http://schemas.microsoft.com/office/word/2010/wordprocessingCanvas" xmlns:mc="http://schemas.openxmlformats.org/markup-compatibility/2006" xmlns:o="urn:schemas-microsoft-com:office:office" xmlns:r="http://schemas.openxmlformats.org/officeDocument/2006/relationships" xmlns:m="http://schemas.openxmlformats.org/officeDocument/2006/math" xmlns:v="urn:schemas-microsoft-com:vml" xmlns:wp14="http://schemas.microsoft.com/office/word/2010/wordprocessingDrawing" xmlns:wp="http://schemas.openxmlformats.org/drawingml/2006/wordprocessingDrawing" xmlns:w10="urn:schemas-microsoft-com:office:word" xmlns:w="http://schemas.openxmlformats.org/wordprocessingml/2006/main" xmlns:w14="http://schemas.microsoft.com/office/word/2010/wordml" xmlns:wpg="http://schemas.microsoft.com/office/word/2010/wordprocessingGroup" xmlns:wpi="http://schemas.microsoft.com/office/word/2010/wordprocessingInk" xmlns:wne="http://schemas.microsoft.com/office/word/2006/wordml" xmlns:wps="http://schemas.microsoft.com/office/word/2010/wordprocessingShape" mc:Ignorable="w14 wp14">
   <w:p>
     <w:pPr>
       <w:pStyle w:val="Header"/>
-      <w:ind w:left="-864"/>
     </w:pPr>
-    <w:r>
-      <w:rPr>
-        <w:rFonts w:ascii="Arial Narrow" w:eastAsia="Arial" w:hAnsi="Arial Narrow" w:cs="Arial"/>
-        <w:b/>
-        <w:bCs/>
-        <w:noProof/>
-        <w:sz w:val="23"/>
-        <w:szCs w:val="23"/>
-      </w:rPr>
-      <mc:AlternateContent>
-        <mc:Choice Requires="wps">
-          <w:drawing>
-            <wp:anchor distT="45720" distB="45720" distL="114300" distR="114300" simplePos="0" relativeHeight="251661312" behindDoc="1" locked="0" layoutInCell="1" allowOverlap="1" wp14:anchorId="22B2B97B" wp14:editId="5C6B2A1C">
-              <wp:simplePos x="0" y="0"/>
-              <wp:positionH relativeFrom="page">
-                <wp:posOffset>10544175</wp:posOffset>
-              </wp:positionH>
-              <wp:positionV relativeFrom="paragraph">
-                <wp:posOffset>635</wp:posOffset>
-              </wp:positionV>
-              <wp:extent cx="1987550" cy="561975"/>
-              <wp:effectExtent l="0" t="0" r="0" b="0"/>
-              <wp:wrapNone/>
-              <wp:docPr id="11" name="Text Box 2"/>
-              <wp:cNvGraphicFramePr>
-                <a:graphicFrameLocks xmlns:a="http://schemas.openxmlformats.org/drawingml/2006/main"/>
-              </wp:cNvGraphicFramePr>
-              <a:graphic xmlns:a="http://schemas.openxmlformats.org/drawingml/2006/main">
-                <a:graphicData uri="http://schemas.microsoft.com/office/word/2010/wordprocessingShape">
-                  <wps:wsp>
-                    <wps:cNvSpPr txBox="1">
-                      <a:spLocks noChangeArrowheads="1"/>
-                    </wps:cNvSpPr>
-                    <wps:spPr bwMode="auto">
-                      <a:xfrm>
-                        <a:off x="0" y="0"/>
-                        <a:ext cx="1987550" cy="561975"/>
-                      </a:xfrm>
-                      <a:prstGeom prst="rect">
-                        <a:avLst/>
-                      </a:prstGeom>
-                      <a:noFill/>
-                      <a:ln w="9525">
-                        <a:noFill/>
-                        <a:miter lim="800000"/>
-                        <a:headEnd/>
-                        <a:tailEnd/>
-                      </a:ln>
-                    </wps:spPr>
-                    <wps:txbx>
-                      <w:txbxContent>
-                        <w:p>
-                          <w:pPr>
-                            <w:spacing w:line="278" w:lineRule="auto"/>
-                            <w:ind w:right="40"/>
-                            <w:jc w:val="center"/>
-                            <w:rPr>
-                              <w:rFonts w:ascii="Tahoma" w:eastAsia="Arial" w:hAnsi="Tahoma" w:cs="Tahoma"/>
-                              <w:sz w:val="16"/>
-                              <w:szCs w:val="16"/>
-                            </w:rPr>
-                          </w:pPr>
-                          <w:proofErr w:type="spellStart"/>
-                          <w:proofErr w:type="gramStart"/>
-                          <w:r>
-                            <w:rPr>
-                              <w:rFonts w:ascii="Tahoma" w:eastAsia="Arial" w:hAnsi="Tahoma" w:cs="Tahoma"/>
-                              <w:sz w:val="16"/>
-                              <w:szCs w:val="16"/>
-                            </w:rPr>
-                            <w:t>Mouchak</w:t>
-                          </w:r>
-                          <w:proofErr w:type="spellEnd"/>
-                          <w:r>
-                            <w:rPr>
-                              <w:rFonts w:ascii="Tahoma" w:eastAsia="Arial" w:hAnsi="Tahoma" w:cs="Tahoma"/>
-                              <w:sz w:val="16"/>
-                              <w:szCs w:val="16"/>
-                            </w:rPr>
-                            <w:t xml:space="preserve"> (1751), </w:t>
-                          </w:r>
-                          <w:proofErr w:type="spellStart"/>
-                          <w:r>
-                            <w:rPr>
-                              <w:rFonts w:ascii="Tahoma" w:eastAsia="Arial" w:hAnsi="Tahoma" w:cs="Tahoma"/>
-                              <w:sz w:val="16"/>
-                              <w:szCs w:val="16"/>
-                            </w:rPr>
-                            <w:t>Kaliakair</w:t>
-                          </w:r>
-                          <w:proofErr w:type="spellEnd"/>
-                          <w:r>
-                            <w:rPr>
-                              <w:rFonts w:ascii="Tahoma" w:eastAsia="Arial" w:hAnsi="Tahoma" w:cs="Tahoma"/>
-                              <w:sz w:val="16"/>
-                              <w:szCs w:val="16"/>
-                            </w:rPr>
-                            <w:t>.</w:t>
-                          </w:r>
-                          <w:proofErr w:type="gramEnd"/>
-                        </w:p>
-                        <w:p>
-                          <w:pPr>
-                            <w:spacing w:line="278" w:lineRule="auto"/>
-                            <w:ind w:right="40"/>
-                            <w:rPr>
-                              <w:rFonts w:ascii="Tahoma" w:eastAsia="Arial" w:hAnsi="Tahoma" w:cs="Tahoma"/>
-                              <w:sz w:val="16"/>
-                              <w:szCs w:val="16"/>
-                            </w:rPr>
-                          </w:pPr>
-                          <w:r>
-                            <w:rPr>
-                              <w:rFonts w:ascii="Tahoma" w:eastAsia="Arial" w:hAnsi="Tahoma" w:cs="Tahoma"/>
-                              <w:sz w:val="16"/>
-                              <w:szCs w:val="16"/>
-                            </w:rPr>
-                            <w:t xml:space="preserve">         </w:t>
-                          </w:r>
-                          <w:proofErr w:type="spellStart"/>
-                          <w:r>
-                            <w:rPr>
-                              <w:rFonts w:ascii="Tahoma" w:eastAsia="Arial" w:hAnsi="Tahoma" w:cs="Tahoma"/>
-                              <w:sz w:val="16"/>
-                              <w:szCs w:val="16"/>
-                            </w:rPr>
-                            <w:t>Gazipur</w:t>
-                          </w:r>
-                          <w:proofErr w:type="gramStart"/>
-                          <w:r>
-                            <w:rPr>
-                              <w:rFonts w:ascii="Tahoma" w:eastAsia="Arial" w:hAnsi="Tahoma" w:cs="Tahoma"/>
-                              <w:sz w:val="16"/>
-                              <w:szCs w:val="16"/>
-                            </w:rPr>
-                            <w:t>,Dhaka,Bangladesh</w:t>
-                          </w:r>
-                          <w:proofErr w:type="spellEnd"/>
-                          <w:proofErr w:type="gramEnd"/>
-                          <w:r>
-                            <w:rPr>
-                              <w:rFonts w:ascii="Tahoma" w:eastAsia="Arial" w:hAnsi="Tahoma" w:cs="Tahoma"/>
-                              <w:sz w:val="16"/>
-                              <w:szCs w:val="16"/>
-                            </w:rPr>
-                            <w:t>.</w:t>
-                          </w:r>
-                        </w:p>
-                        <w:p>
-                          <w:pPr>
-                            <w:spacing w:line="1" w:lineRule="exact"/>
-                            <w:rPr>
-                              <w:sz w:val="24"/>
-                              <w:szCs w:val="24"/>
-                            </w:rPr>
-                          </w:pPr>
-                        </w:p>
-                        <w:p>
-                          <w:pPr>
-                            <w:spacing w:line="27" w:lineRule="exact"/>
-                            <w:rPr>
-                              <w:sz w:val="24"/>
-                              <w:szCs w:val="24"/>
-                            </w:rPr>
-                          </w:pPr>
-                        </w:p>
-                        <w:p>
-                          <w:pPr>
-                            <w:jc w:val="right"/>
-                          </w:pPr>
-                        </w:p>
-                      </w:txbxContent>
-                    </wps:txbx>
-                    <wps:bodyPr rot="0" vert="horz" wrap="square" lIns="91440" tIns="45720" rIns="91440" bIns="45720" anchor="t" anchorCtr="0">
-                      <a:noAutofit/>
-                    </wps:bodyPr>
-                  </wps:wsp>
-                </a:graphicData>
-              </a:graphic>
-              <wp14:sizeRelH relativeFrom="margin">
-                <wp14:pctWidth>0</wp14:pctWidth>
-              </wp14:sizeRelH>
-              <wp14:sizeRelV relativeFrom="margin">
-                <wp14:pctHeight>0</wp14:pctHeight>
-              </wp14:sizeRelV>
-            </wp:anchor>
-          </w:drawing>
-        </mc:Choice>
-        <mc:Fallback>
-          <w:pict>
-            <v:shapetype id="_x0000_t202" coordsize="21600,21600" o:spt="202" path="m,l,21600r21600,l21600,xe">
-              <v:stroke joinstyle="miter"/>
-              <v:path gradientshapeok="t" o:connecttype="rect"/>
-            </v:shapetype>
-            <v:shape id="_x0000_s1027" type="#_x0000_t202" style="position:absolute;left:0;text-align:left;margin-left:830.25pt;margin-top:.05pt;width:156.5pt;height:44.25pt;z-index:-251655168;visibility:visible;mso-wrap-style:square;mso-width-percent:0;mso-height-percent:0;mso-wrap-distance-left:9pt;mso-wrap-distance-top:3.6pt;mso-wrap-distance-right:9pt;mso-wrap-distance-bottom:3.6pt;mso-position-horizontal:absolute;mso-position-horizontal-relative:page;mso-position-vertical:absolute;mso-position-vertical-relative:text;mso-width-percent:0;mso-height-percent:0;mso-width-relative:margin;mso-height-relative:margin;v-text-anchor:top" o:gfxdata="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" filled="f" stroked="f">
-              <v:textbox>
-                <w:txbxContent>
-                  <w:p>
-                    <w:pPr>
-                      <w:spacing w:line="278" w:lineRule="auto"/>
-                      <w:ind w:right="40"/>
-                      <w:jc w:val="center"/>
-                      <w:rPr>
-                        <w:rFonts w:ascii="Tahoma" w:eastAsia="Arial" w:hAnsi="Tahoma" w:cs="Tahoma"/>
-                        <w:sz w:val="16"/>
-                        <w:szCs w:val="16"/>
-                      </w:rPr>
-                    </w:pPr>
-                    <w:proofErr w:type="spellStart"/>
-                    <w:proofErr w:type="gramStart"/>
-                    <w:r>
-                      <w:rPr>
-                        <w:rFonts w:ascii="Tahoma" w:eastAsia="Arial" w:hAnsi="Tahoma" w:cs="Tahoma"/>
-                        <w:sz w:val="16"/>
-                        <w:szCs w:val="16"/>
-                      </w:rPr>
-                      <w:t>Mouchak</w:t>
-                    </w:r>
-                    <w:proofErr w:type="spellEnd"/>
-                    <w:r>
-                      <w:rPr>
-                        <w:rFonts w:ascii="Tahoma" w:eastAsia="Arial" w:hAnsi="Tahoma" w:cs="Tahoma"/>
-                        <w:sz w:val="16"/>
-                        <w:szCs w:val="16"/>
-                      </w:rPr>
-                      <w:t xml:space="preserve"> (1751), </w:t>
-                    </w:r>
-                    <w:proofErr w:type="spellStart"/>
-                    <w:r>
-                      <w:rPr>
-                        <w:rFonts w:ascii="Tahoma" w:eastAsia="Arial" w:hAnsi="Tahoma" w:cs="Tahoma"/>
-                        <w:sz w:val="16"/>
-                        <w:szCs w:val="16"/>
-                      </w:rPr>
-                      <w:t>Kaliakair</w:t>
-                    </w:r>
-                    <w:proofErr w:type="spellEnd"/>
-                    <w:r>
-                      <w:rPr>
-                        <w:rFonts w:ascii="Tahoma" w:eastAsia="Arial" w:hAnsi="Tahoma" w:cs="Tahoma"/>
-                        <w:sz w:val="16"/>
-                        <w:szCs w:val="16"/>
-                      </w:rPr>
-                      <w:t>.</w:t>
-                    </w:r>
-                    <w:proofErr w:type="gramEnd"/>
-                  </w:p>
-                  <w:p>
-                    <w:pPr>
-                      <w:spacing w:line="278" w:lineRule="auto"/>
-                      <w:ind w:right="40"/>
-                      <w:rPr>
-                        <w:rFonts w:ascii="Tahoma" w:eastAsia="Arial" w:hAnsi="Tahoma" w:cs="Tahoma"/>
-                        <w:sz w:val="16"/>
-                        <w:szCs w:val="16"/>
-                      </w:rPr>
-                    </w:pPr>
-                    <w:r>
-                      <w:rPr>
-                        <w:rFonts w:ascii="Tahoma" w:eastAsia="Arial" w:hAnsi="Tahoma" w:cs="Tahoma"/>
-                        <w:sz w:val="16"/>
-                        <w:szCs w:val="16"/>
-                      </w:rPr>
-                      <w:t xml:space="preserve">         </w:t>
-                    </w:r>
-                    <w:proofErr w:type="spellStart"/>
-                    <w:r>
-                      <w:rPr>
-                        <w:rFonts w:ascii="Tahoma" w:eastAsia="Arial" w:hAnsi="Tahoma" w:cs="Tahoma"/>
-                        <w:sz w:val="16"/>
-                        <w:szCs w:val="16"/>
-                      </w:rPr>
-                      <w:t>Gazipur</w:t>
-                    </w:r>
-                    <w:proofErr w:type="gramStart"/>
-                    <w:r>
-                      <w:rPr>
-                        <w:rFonts w:ascii="Tahoma" w:eastAsia="Arial" w:hAnsi="Tahoma" w:cs="Tahoma"/>
-                        <w:sz w:val="16"/>
-                        <w:szCs w:val="16"/>
-                      </w:rPr>
-                      <w:t>,Dhaka,Bangladesh</w:t>
-                    </w:r>
-                    <w:proofErr w:type="spellEnd"/>
-                    <w:proofErr w:type="gramEnd"/>
-                    <w:r>
-                      <w:rPr>
-                        <w:rFonts w:ascii="Tahoma" w:eastAsia="Arial" w:hAnsi="Tahoma" w:cs="Tahoma"/>
-                        <w:sz w:val="16"/>
-                        <w:szCs w:val="16"/>
-                      </w:rPr>
-                      <w:t>.</w:t>
-                    </w:r>
-                  </w:p>
-                  <w:p>
-                    <w:pPr>
-                      <w:spacing w:line="1" w:lineRule="exact"/>
-                      <w:rPr>
-                        <w:sz w:val="24"/>
-                        <w:szCs w:val="24"/>
-                      </w:rPr>
-                    </w:pPr>
-                  </w:p>
-                  <w:p>
-                    <w:pPr>
-                      <w:spacing w:line="27" w:lineRule="exact"/>
-                      <w:rPr>
-                        <w:sz w:val="24"/>
-                        <w:szCs w:val="24"/>
-                      </w:rPr>
-                    </w:pPr>
-                  </w:p>
-                  <w:p>
-                    <w:pPr>
-                      <w:jc w:val="right"/>
-                    </w:pPr>
-                  </w:p>
-                </w:txbxContent>
-              </v:textbox>
-              <w10:wrap anchorx="page"/>
-            </v:shape>
-          </w:pict>
-        </mc:Fallback>
-      </mc:AlternateContent>
-    </w:r>
-    <w:r>
-      <w:rPr>
-        <w:noProof/>
-      </w:rPr>
-      <mc:AlternateContent>
-        <mc:Choice Requires="wps">
-          <w:drawing>
-            <wp:anchor distT="0" distB="0" distL="114300" distR="114300" simplePos="0" relativeHeight="251659264" behindDoc="0" locked="0" layoutInCell="1" allowOverlap="1" wp14:anchorId="567FE6E7" wp14:editId="6079407D">
-              <wp:simplePos x="0" y="0"/>
-              <wp:positionH relativeFrom="column">
-                <wp:posOffset>-554355</wp:posOffset>
-              </wp:positionH>
-              <wp:positionV relativeFrom="paragraph">
-                <wp:posOffset>571500</wp:posOffset>
-              </wp:positionV>
-              <wp:extent cx="2614295" cy="246380"/>
-              <wp:effectExtent l="0" t="0" r="14605" b="20320"/>
-              <wp:wrapNone/>
-              <wp:docPr id="7" name="Rectangle 7"/>
-              <wp:cNvGraphicFramePr/>
-              <a:graphic xmlns:a="http://schemas.openxmlformats.org/drawingml/2006/main">
-                <a:graphicData uri="http://schemas.microsoft.com/office/word/2010/wordprocessingShape">
-                  <wps:wsp>
-                    <wps:cNvSpPr/>
-                    <wps:spPr>
-                      <a:xfrm>
-                        <a:off x="0" y="0"/>
-                        <a:ext cx="2614295" cy="246380"/>
-                      </a:xfrm>
-                      <a:prstGeom prst="rect">
-                        <a:avLst/>
-                      </a:prstGeom>
-                      <a:ln>
-                        <a:solidFill>
-                          <a:schemeClr val="bg1"/>
-                        </a:solidFill>
-                      </a:ln>
-                    </wps:spPr>
-                    <wps:style>
-                      <a:lnRef idx="2">
-                        <a:schemeClr val="accent3"/>
-                      </a:lnRef>
-                      <a:fillRef idx="1">
-                        <a:schemeClr val="lt1"/>
-                      </a:fillRef>
-                      <a:effectRef idx="0">
-                        <a:schemeClr val="accent3"/>
-                      </a:effectRef>
-                      <a:fontRef idx="minor">
-                        <a:schemeClr val="dk1"/>
-                      </a:fontRef>
-                    </wps:style>
-                    <wps:txbx>
-                      <w:txbxContent>
-                        <w:p>
-                          <w:pPr>
-                            <w:rPr>
-                              <w:b/>
-                            </w:rPr>
-                          </w:pPr>
-                          <w:proofErr w:type="spellStart"/>
-                          <w:r>
-                            <w:rPr>
-                              <w:rFonts w:ascii="Arial" w:eastAsia="Arial" w:hAnsi="Arial" w:cs="Arial"/>
-                              <w:b/>
-                              <w:sz w:val="16"/>
-                              <w:szCs w:val="16"/>
-                            </w:rPr>
-                            <w:t>Sadma</w:t>
-                          </w:r>
-                          <w:proofErr w:type="spellEnd"/>
-                          <w:r>
-                            <w:rPr>
-                              <w:rFonts w:ascii="Arial" w:eastAsia="Arial" w:hAnsi="Arial" w:cs="Arial"/>
-                              <w:b/>
-                              <w:sz w:val="16"/>
-                              <w:szCs w:val="16"/>
-                            </w:rPr>
-                            <w:t xml:space="preserve"> Fashion Wear Ltd</w:t>
-                          </w:r>
-                        </w:p>
-                      </w:txbxContent>
-                    </wps:txbx>
-                    <wps:bodyPr rot="0" spcFirstLastPara="0" vertOverflow="overflow" horzOverflow="overflow" vert="horz" wrap="square" lIns="91440" tIns="45720" rIns="91440" bIns="45720" numCol="1" spcCol="0" rtlCol="0" fromWordArt="0" anchor="ctr" anchorCtr="0" forceAA="0" compatLnSpc="1">
-                      <a:prstTxWarp prst="textNoShape">
-                        <a:avLst/>
-                      </a:prstTxWarp>
-                      <a:noAutofit/>
-                    </wps:bodyPr>
-                  </wps:wsp>
-                </a:graphicData>
-              </a:graphic>
-              <wp14:sizeRelH relativeFrom="margin">
-                <wp14:pctWidth>0</wp14:pctWidth>
-              </wp14:sizeRelH>
-              <wp14:sizeRelV relativeFrom="margin">
-                <wp14:pctHeight>0</wp14:pctHeight>
-              </wp14:sizeRelV>
-            </wp:anchor>
-          </w:drawing>
-        </mc:Choice>
-        <mc:Fallback>
-          <w:pict>
-            <v:rect id="Rectangle 7" o:spid="_x0000_s1028" style="position:absolute;left:0;text-align:left;margin-left:-43.65pt;margin-top:45pt;width:205.85pt;height:19.4pt;z-index:251659264;visibility:visible;mso-wrap-style:square;mso-width-percent:0;mso-height-percent:0;mso-wrap-distance-left:9pt;mso-wrap-distance-top:0;mso-wrap-distance-right:9pt;mso-wrap-distance-bottom:0;mso-position-horizontal:absolute;mso-position-horizontal-relative:text;mso-position-vertical:absolute;mso-position-vertical-relative:text;mso-width-percent:0;mso-height-percent:0;mso-width-relative:margin;mso-height-relative:margin;v-text-anchor:middle" o:gfxdata="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" fillcolor="white [3201]" strokecolor="white [3212]" strokeweight="1pt">
-              <v:textbox>
-                <w:txbxContent>
-                  <w:p>
-                    <w:pPr>
-                      <w:rPr>
-                        <w:b/>
-                      </w:rPr>
-                    </w:pPr>
-                    <w:proofErr w:type="spellStart"/>
-                    <w:r>
-                      <w:rPr>
-                        <w:rFonts w:ascii="Arial" w:eastAsia="Arial" w:hAnsi="Arial" w:cs="Arial"/>
-                        <w:b/>
-                        <w:sz w:val="16"/>
-                        <w:szCs w:val="16"/>
-                      </w:rPr>
-                      <w:t>Sadma</w:t>
-                    </w:r>
-                    <w:proofErr w:type="spellEnd"/>
-                    <w:r>
-                      <w:rPr>
-                        <w:rFonts w:ascii="Arial" w:eastAsia="Arial" w:hAnsi="Arial" w:cs="Arial"/>
-                        <w:b/>
-                        <w:sz w:val="16"/>
-                        <w:szCs w:val="16"/>
-                      </w:rPr>
-                      <w:t xml:space="preserve"> Fashion Wear Ltd</w:t>
-                    </w:r>
-                  </w:p>
-                </w:txbxContent>
-              </v:textbox>
-            </v:rect>
-          </w:pict>
-        </mc:Fallback>
-      </mc:AlternateContent>
-    </w:r>
+  </w:p>
+  <w:p>
+    <w:pPr>
+      <w:pStyle w:val="Header"/>
+    </w:pPr>
     <w:r>
       <w:rPr>
         <w:noProof/>
       </w:rPr>
       <w:drawing>
-        <wp:inline distT="0" distB="0" distL="0" distR="0" wp14:anchorId="200C5D85" wp14:editId="4C7CE237">
+        <wp:inline distT="0" distB="0" distL="0" distR="0" wp14:anchorId="56692C9A" wp14:editId="4516183C">
           <wp:extent cx="1638300" cy="590550"/>
           <wp:effectExtent l="0" t="0" r="0" b="0"/>
           <wp:docPr id="1" name="Picture 1"/>
@@ -1670,6 +1499,16 @@
 </w:hdr>
 </file>
 
+<file path=word/header3.xml><?xml version="1.0" encoding="utf-8"?>
+<w:hdr xmlns:wpc="http://schemas.microsoft.com/office/word/2010/wordprocessingCanvas" xmlns:mc="http://schemas.openxmlformats.org/markup-compatibility/2006" xmlns:o="urn:schemas-microsoft-com:office:office" xmlns:r="http://schemas.openxmlformats.org/officeDocument/2006/relationships" xmlns:m="http://schemas.openxmlformats.org/officeDocument/2006/math" xmlns:v="urn:schemas-microsoft-com:vml" xmlns:wp14="http://schemas.microsoft.com/office/word/2010/wordprocessingDrawing" xmlns:wp="http://schemas.openxmlformats.org/drawingml/2006/wordprocessingDrawing" xmlns:w10="urn:schemas-microsoft-com:office:word" xmlns:w="http://schemas.openxmlformats.org/wordprocessingml/2006/main" xmlns:w14="http://schemas.microsoft.com/office/word/2010/wordml" xmlns:wpg="http://schemas.microsoft.com/office/word/2010/wordprocessingGroup" xmlns:wpi="http://schemas.microsoft.com/office/word/2010/wordprocessingInk" xmlns:wne="http://schemas.microsoft.com/office/word/2006/wordml" xmlns:wps="http://schemas.microsoft.com/office/word/2010/wordprocessingShape" mc:Ignorable="w14 wp14">
+  <w:p>
+    <w:pPr>
+      <w:pStyle w:val="Header"/>
+    </w:pPr>
+  </w:p>
+</w:hdr>
+</file>
+
 <file path=word/numbering.xml><?xml version="1.0" encoding="utf-8"?>
 <w:numbering xmlns:wpc="http://schemas.microsoft.com/office/word/2010/wordprocessingCanvas" xmlns:mc="http://schemas.openxmlformats.org/markup-compatibility/2006" xmlns:o="urn:schemas-microsoft-com:office:office" xmlns:r="http://schemas.openxmlformats.org/officeDocument/2006/relationships" xmlns:m="http://schemas.openxmlformats.org/officeDocument/2006/math" xmlns:v="urn:schemas-microsoft-com:vml" xmlns:wp14="http://schemas.microsoft.com/office/word/2010/wordprocessingDrawing" xmlns:wp="http://schemas.openxmlformats.org/drawingml/2006/wordprocessingDrawing" xmlns:w10="urn:schemas-microsoft-com:office:word" xmlns:w="http://schemas.openxmlformats.org/wordprocessingml/2006/main" xmlns:w14="http://schemas.microsoft.com/office/word/2010/wordml" xmlns:wpg="http://schemas.microsoft.com/office/word/2010/wordprocessingGroup" xmlns:wpi="http://schemas.microsoft.com/office/word/2010/wordprocessingInk" xmlns:wne="http://schemas.microsoft.com/office/word/2006/wordml" xmlns:wps="http://schemas.microsoft.com/office/word/2010/wordprocessingShape" mc:Ignorable="w14 wp14">
   <w:abstractNum w:abstractNumId="0">
@@ -1940,7 +1779,11 @@
         <w:lang w:val="en-US" w:eastAsia="en-US" w:bidi="ar-SA"/>
       </w:rPr>
     </w:rPrDefault>
-    <w:pPrDefault/>
+    <w:pPrDefault>
+      <w:pPr>
+        <w:spacing w:after="160" w:line="259" w:lineRule="auto"/>
+      </w:pPr>
+    </w:pPrDefault>
   </w:docDefaults>
   <w:latentStyles w:defLockedState="0" w:defUIPriority="99" w:defSemiHidden="1" w:defUnhideWhenUsed="1" w:defQFormat="0" w:count="267">
     <w:lsdException w:name="Normal" w:semiHidden="0" w:uiPriority="0" w:unhideWhenUsed="0" w:qFormat="1"/>
@@ -2121,6 +1964,9 @@
     <w:basedOn w:val="TableNormal"/>
     <w:uiPriority w:val="39"/>
     <w:rsid w:val="00E11788"/>
+    <w:pPr>
+      <w:spacing w:after="0" w:line="240" w:lineRule="auto"/>
+    </w:pPr>
     <w:tblPr>
       <w:tblBorders>
         <w:top w:val="single" w:sz="4" w:space="0" w:color="auto"/>
@@ -2144,6 +1990,7 @@
         <w:tab w:val="center" w:pos="4680"/>
         <w:tab w:val="right" w:pos="9360"/>
       </w:tabs>
+      <w:spacing w:after="0" w:line="240" w:lineRule="auto"/>
     </w:pPr>
   </w:style>
   <w:style w:type="character" w:customStyle="1" w:styleId="HeaderChar">
@@ -2165,6 +2012,7 @@
         <w:tab w:val="center" w:pos="4680"/>
         <w:tab w:val="right" w:pos="9360"/>
       </w:tabs>
+      <w:spacing w:after="0" w:line="240" w:lineRule="auto"/>
     </w:pPr>
   </w:style>
   <w:style w:type="character" w:customStyle="1" w:styleId="FooterChar">
@@ -2194,6 +2042,9 @@
     <w:semiHidden/>
     <w:unhideWhenUsed/>
     <w:rsid w:val="0025478F"/>
+    <w:pPr>
+      <w:spacing w:line="240" w:lineRule="auto"/>
+    </w:pPr>
     <w:rPr>
       <w:sz w:val="20"/>
       <w:szCs w:val="20"/>
@@ -2247,6 +2098,9 @@
     <w:semiHidden/>
     <w:unhideWhenUsed/>
     <w:rsid w:val="0025478F"/>
+    <w:pPr>
+      <w:spacing w:after="0" w:line="240" w:lineRule="auto"/>
+    </w:pPr>
     <w:rPr>
       <w:rFonts w:ascii="Segoe UI" w:hAnsi="Segoe UI" w:cs="Segoe UI"/>
       <w:sz w:val="18"/>
@@ -2296,7 +2150,11 @@
         <w:lang w:val="en-US" w:eastAsia="en-US" w:bidi="ar-SA"/>
       </w:rPr>
     </w:rPrDefault>
-    <w:pPrDefault/>
+    <w:pPrDefault>
+      <w:pPr>
+        <w:spacing w:after="160" w:line="259" w:lineRule="auto"/>
+      </w:pPr>
+    </w:pPrDefault>
   </w:docDefaults>
   <w:latentStyles w:defLockedState="0" w:defUIPriority="99" w:defSemiHidden="1" w:defUnhideWhenUsed="1" w:defQFormat="0" w:count="267">
     <w:lsdException w:name="Normal" w:semiHidden="0" w:uiPriority="0" w:unhideWhenUsed="0" w:qFormat="1"/>
@@ -2477,6 +2335,9 @@
     <w:basedOn w:val="TableNormal"/>
     <w:uiPriority w:val="39"/>
     <w:rsid w:val="00E11788"/>
+    <w:pPr>
+      <w:spacing w:after="0" w:line="240" w:lineRule="auto"/>
+    </w:pPr>
     <w:tblPr>
       <w:tblBorders>
         <w:top w:val="single" w:sz="4" w:space="0" w:color="auto"/>
@@ -2500,6 +2361,7 @@
         <w:tab w:val="center" w:pos="4680"/>
         <w:tab w:val="right" w:pos="9360"/>
       </w:tabs>
+      <w:spacing w:after="0" w:line="240" w:lineRule="auto"/>
     </w:pPr>
   </w:style>
   <w:style w:type="character" w:customStyle="1" w:styleId="HeaderChar">
@@ -2521,6 +2383,7 @@
         <w:tab w:val="center" w:pos="4680"/>
         <w:tab w:val="right" w:pos="9360"/>
       </w:tabs>
+      <w:spacing w:after="0" w:line="240" w:lineRule="auto"/>
     </w:pPr>
   </w:style>
   <w:style w:type="character" w:customStyle="1" w:styleId="FooterChar">
@@ -2550,6 +2413,9 @@
     <w:semiHidden/>
     <w:unhideWhenUsed/>
     <w:rsid w:val="0025478F"/>
+    <w:pPr>
+      <w:spacing w:line="240" w:lineRule="auto"/>
+    </w:pPr>
     <w:rPr>
       <w:sz w:val="20"/>
       <w:szCs w:val="20"/>
@@ -2603,6 +2469,9 @@
     <w:semiHidden/>
     <w:unhideWhenUsed/>
     <w:rsid w:val="0025478F"/>
+    <w:pPr>
+      <w:spacing w:after="0" w:line="240" w:lineRule="auto"/>
+    </w:pPr>
     <w:rPr>
       <w:rFonts w:ascii="Segoe UI" w:hAnsi="Segoe UI" w:cs="Segoe UI"/>
       <w:sz w:val="18"/>
@@ -2930,7 +2799,7 @@
   <a:extraClrSchemeLst/>
   <a:extLst>
     <a:ext uri="{05A4C25C-085E-4340-85A3-A5531E510DB2}">
-      <thm15:themeFamily xmlns="" xmlns:thm15="http://schemas.microsoft.com/office/thememl/2012/main" name="Office Theme" id="{62F939B6-93AF-4DB8-9C6B-D6C7DFDC589F}" vid="{4A3C46E8-61CC-4603-A589-7422A47A8E4A}"/>
+      <thm15:themeFamily xmlns:thm15="http://schemas.microsoft.com/office/thememl/2012/main" xmlns="" name="Office Theme" id="{62F939B6-93AF-4DB8-9C6B-D6C7DFDC589F}" vid="{4A3C46E8-61CC-4603-A589-7422A47A8E4A}"/>
     </a:ext>
   </a:extLst>
 </a:theme>
@@ -2941,7 +2810,7 @@
 </file>
 
 <file path=customXml/itemProps1.xml><?xml version="1.0" encoding="utf-8"?>
-<ds:datastoreItem xmlns:ds="http://schemas.openxmlformats.org/officeDocument/2006/customXml" ds:itemID="{56E5F485-222A-4F68-BC0A-58240CD92268}">
+<ds:datastoreItem xmlns:ds="http://schemas.openxmlformats.org/officeDocument/2006/customXml" ds:itemID="{ABBAD167-7399-4F0B-A887-12D18F1E0401}">
   <ds:schemaRefs>
     <ds:schemaRef ds:uri="http://schemas.openxmlformats.org/officeDocument/2006/bibliography"/>
   </ds:schemaRefs>

</xml_diff>